<commit_message>
Small change to 444 syllabus
</commit_message>
<xml_diff>
--- a/F26-Phil444-site/syllabus-F26-444.docx
+++ b/F26-Phil444-site/syllabus-F26-444.docx
@@ -923,7 +923,7 @@
         <w:t xml:space="preserve">Quiz</w:t>
       </w:r>
       <w:r>
-        <w:t xml:space="preserve">: Quiz 1 on Canvas, due Friday, September 11.</w:t>
+        <w:t xml:space="preserve">: Quiz 1 on Canvas, due Friday, September 11 at 5pm.</w:t>
       </w:r>
     </w:p>
     <w:bookmarkEnd w:id="23"/>
@@ -1050,7 +1050,7 @@
         <w:t xml:space="preserve">Quiz</w:t>
       </w:r>
       <w:r>
-        <w:t xml:space="preserve">: Quiz 2 on Canvas, due Friday, September 18.</w:t>
+        <w:t xml:space="preserve">: Quiz 2 on Canvas, due Friday, September 18 at 5pm.</w:t>
       </w:r>
     </w:p>
     <w:bookmarkEnd w:id="26"/>
@@ -1177,7 +1177,7 @@
         <w:t xml:space="preserve">Quiz</w:t>
       </w:r>
       <w:r>
-        <w:t xml:space="preserve">: Quiz 3 on Canvas, due Friday, September 25.</w:t>
+        <w:t xml:space="preserve">: Quiz 3 on Canvas, due Friday, September 25 at 5pm.</w:t>
       </w:r>
     </w:p>
     <w:bookmarkEnd w:id="29"/>
@@ -1488,7 +1488,7 @@
         <w:t xml:space="preserve">Quiz</w:t>
       </w:r>
       <w:r>
-        <w:t xml:space="preserve">: Quiz 4 on Canvas, due Friday, October 09.</w:t>
+        <w:t xml:space="preserve">: Quiz 4 on Canvas, due Friday, October 09 at 5pm.</w:t>
       </w:r>
     </w:p>
     <w:bookmarkEnd w:id="37"/>
@@ -2051,7 +2051,7 @@
         <w:t xml:space="preserve">Quiz</w:t>
       </w:r>
       <w:r>
-        <w:t xml:space="preserve">: Quiz 5, on Canvas, due Friday, November 06.</w:t>
+        <w:t xml:space="preserve">: Quiz 5, on Canvas, due Friday, November 06 at 5pm.</w:t>
       </w:r>
     </w:p>
     <w:bookmarkEnd w:id="51"/>
@@ -2178,7 +2178,7 @@
         <w:t xml:space="preserve">Quiz</w:t>
       </w:r>
       <w:r>
-        <w:t xml:space="preserve">: Quiz 6, on Canvas, due Friday, November 13.</w:t>
+        <w:t xml:space="preserve">: Quiz 6, on Canvas, due Friday, November 13 at 5pm.</w:t>
       </w:r>
     </w:p>
     <w:bookmarkEnd w:id="54"/>
@@ -2413,7 +2413,7 @@
         <w:t xml:space="preserve">Quiz</w:t>
       </w:r>
       <w:r>
-        <w:t xml:space="preserve">: Quiz 7, on Canvas, due Friday, November 20.</w:t>
+        <w:t xml:space="preserve">: Quiz 7, on Canvas, due Friday, November 20 at 5pm.</w:t>
       </w:r>
     </w:p>
     <w:bookmarkEnd w:id="60"/>
@@ -2688,7 +2688,7 @@
         <w:t xml:space="preserve">Quiz</w:t>
       </w:r>
       <w:r>
-        <w:t xml:space="preserve">: Quiz 8, on Canvas, due Friday, December 04.</w:t>
+        <w:t xml:space="preserve">: Quiz 8, on Canvas, due Friday, December 04 at 5pm.</w:t>
       </w:r>
     </w:p>
     <w:bookmarkEnd w:id="68"/>

</xml_diff>